<commit_message>
Report: complete per-issue evidence fields
Add the exact command, log and reproducer to every XEZ-UVM entry that
lacked one, explicit tool versions and reproduction steps, log
evidence for the documented coverage limitation, and a note on Gen5
and Gen7 applicability.

Co-Authored-By: Claude Opus 5.5 <noreply@anthropic.com>
</commit_message>
<xml_diff>
--- a/dv/eval/xezim_uvm_limitations.docx
+++ b/dv/eval/xezim_uvm_limitations.docx
@@ -8212,6 +8212,37 @@
           <w:sz w:val="21"/>
           <w:szCs w:val="21"/>
         </w:rPr>
+        <w:t xml:space="preserve">Tool versions: </w:t>
+      </w:r>
+      <w:r>
+        <w:rPr>
+          <w:rFonts w:ascii="Georgia" w:cs="Georgia" w:eastAsia="Georgia" w:hAnsi="Georgia"/>
+          <w:color w:val="222222"/>
+          <w:sz w:val="21"/>
+          <w:szCs w:val="21"/>
+        </w:rPr>
+        <w:t xml:space="preserve">xezim 0.11.1, build A 0.11.1-45-g83df0dd5 and build B 23f3728c (both print === xezim 0.11.1 === and their git hash in every log). Reference: Verilator 5.050. UVM: Accellera 1.2 unless stated.</w:t>
+      </w:r>
+    </w:p>
+    <w:p>
+      <w:pPr>
+        <w:pStyle w:val="ListParagraph"/>
+        <w:numPr>
+          <w:ilvl w:val="0"/>
+          <w:numId w:val="2"/>
+        </w:numPr>
+        <w:spacing w:after="90" w:line="270"/>
+        <w:jc w:val="both"/>
+      </w:pPr>
+      <w:r>
+        <w:rPr>
+          <w:rFonts w:ascii="Georgia" w:cs="Georgia" w:eastAsia="Georgia" w:hAnsi="Georgia"/>
+          <w:b/>
+          <w:bCs/>
+          <w:color w:val="1C2B29"/>
+          <w:sz w:val="21"/>
+          <w:szCs w:val="21"/>
+        </w:rPr>
         <w:t xml:space="preserve">Builds: </w:t>
       </w:r>
       <w:r>
@@ -8222,6 +8253,37 @@
           <w:szCs w:val="21"/>
         </w:rPr>
         <w:t xml:space="preserve">reproduced on build A (83df0dd5) and build B (23f3728c).</w:t>
+      </w:r>
+    </w:p>
+    <w:p>
+      <w:pPr>
+        <w:pStyle w:val="ListParagraph"/>
+        <w:numPr>
+          <w:ilvl w:val="0"/>
+          <w:numId w:val="2"/>
+        </w:numPr>
+        <w:spacing w:after="90" w:line="270"/>
+        <w:jc w:val="both"/>
+      </w:pPr>
+      <w:r>
+        <w:rPr>
+          <w:rFonts w:ascii="Georgia" w:cs="Georgia" w:eastAsia="Georgia" w:hAnsi="Georgia"/>
+          <w:b/>
+          <w:bCs/>
+          <w:color w:val="1C2B29"/>
+          <w:sz w:val="21"/>
+          <w:szCs w:val="21"/>
+        </w:rPr>
+        <w:t xml:space="preserve">Reproduction steps: </w:t>
+      </w:r>
+      <w:r>
+        <w:rPr>
+          <w:rFonts w:ascii="Georgia" w:cs="Georgia" w:eastAsia="Georgia" w:hAnsi="Georgia"/>
+          <w:color w:val="222222"/>
+          <w:sz w:val="21"/>
+          <w:szCs w:val="21"/>
+        </w:rPr>
+        <w:t xml:space="preserve">cd dv/eval/cases2, then run the command given in the entry (or ./run_cases.sh &lt;case&gt;.sv to run it on build A, build B and Verilator and store the logs).</w:t>
       </w:r>
     </w:p>
     <w:p>
@@ -12607,6 +12669,37 @@
           <w:sz w:val="21"/>
           <w:szCs w:val="21"/>
         </w:rPr>
+        <w:t xml:space="preserve">Command: </w:t>
+      </w:r>
+      <w:r>
+        <w:rPr>
+          <w:rFonts w:ascii="Georgia" w:cs="Georgia" w:eastAsia="Georgia" w:hAnsi="Georgia"/>
+          <w:color w:val="222222"/>
+          <w:sz w:val="21"/>
+          <w:szCs w:val="21"/>
+        </w:rPr>
+        <w:t xml:space="preserve">xezim -s top e_static_call_via_handle.sv; UVM form xezim -uvm -s top --max-time 1ms +incdir+../uvm_suite e_u05_member_n_original.sv +UVM_TESTNAME=t</w:t>
+      </w:r>
+    </w:p>
+    <w:p>
+      <w:pPr>
+        <w:pStyle w:val="ListParagraph"/>
+        <w:numPr>
+          <w:ilvl w:val="0"/>
+          <w:numId w:val="2"/>
+        </w:numPr>
+        <w:spacing w:after="90" w:line="270"/>
+        <w:jc w:val="both"/>
+      </w:pPr>
+      <w:r>
+        <w:rPr>
+          <w:rFonts w:ascii="Georgia" w:cs="Georgia" w:eastAsia="Georgia" w:hAnsi="Georgia"/>
+          <w:b/>
+          <w:bCs/>
+          <w:color w:val="1C2B29"/>
+          <w:sz w:val="21"/>
+          <w:szCs w:val="21"/>
+        </w:rPr>
         <w:t xml:space="preserve">Log (build A, exit 0): </w:t>
       </w:r>
       <w:r>
@@ -13565,6 +13658,37 @@
           <w:sz w:val="21"/>
           <w:szCs w:val="21"/>
         </w:rPr>
+        <w:t xml:space="preserve">Command: </w:t>
+      </w:r>
+      <w:r>
+        <w:rPr>
+          <w:rFonts w:ascii="Georgia" w:cs="Georgia" w:eastAsia="Georgia" w:hAnsi="Georgia"/>
+          <w:color w:val="222222"/>
+          <w:sz w:val="21"/>
+          <w:szCs w:val="21"/>
+        </w:rPr>
+        <w:t xml:space="preserve">xezim -s t e_fn_return_string_index.sv; UVM form xezim -uvm -s top --max-time 1ms e_packer_string.sv</w:t>
+      </w:r>
+    </w:p>
+    <w:p>
+      <w:pPr>
+        <w:pStyle w:val="ListParagraph"/>
+        <w:numPr>
+          <w:ilvl w:val="0"/>
+          <w:numId w:val="2"/>
+        </w:numPr>
+        <w:spacing w:after="90" w:line="270"/>
+        <w:jc w:val="both"/>
+      </w:pPr>
+      <w:r>
+        <w:rPr>
+          <w:rFonts w:ascii="Georgia" w:cs="Georgia" w:eastAsia="Georgia" w:hAnsi="Georgia"/>
+          <w:b/>
+          <w:bCs/>
+          <w:color w:val="1C2B29"/>
+          <w:sz w:val="21"/>
+          <w:szCs w:val="21"/>
+        </w:rPr>
         <w:t xml:space="preserve">Log (build A, exit 0): </w:t>
       </w:r>
       <w:r>
@@ -14717,6 +14841,37 @@
           <w:sz w:val="21"/>
           <w:szCs w:val="21"/>
         </w:rPr>
+        <w:t xml:space="preserve">Command: </w:t>
+      </w:r>
+      <w:r>
+        <w:rPr>
+          <w:rFonts w:ascii="Georgia" w:cs="Georgia" w:eastAsia="Georgia" w:hAnsi="Georgia"/>
+          <w:color w:val="222222"/>
+          <w:sz w:val="21"/>
+          <w:szCs w:val="21"/>
+        </w:rPr>
+        <w:t xml:space="preserve">xezim -s t e_event_ptrigger_race.sv</w:t>
+      </w:r>
+    </w:p>
+    <w:p>
+      <w:pPr>
+        <w:pStyle w:val="ListParagraph"/>
+        <w:numPr>
+          <w:ilvl w:val="0"/>
+          <w:numId w:val="2"/>
+        </w:numPr>
+        <w:spacing w:after="90" w:line="270"/>
+        <w:jc w:val="both"/>
+      </w:pPr>
+      <w:r>
+        <w:rPr>
+          <w:rFonts w:ascii="Georgia" w:cs="Georgia" w:eastAsia="Georgia" w:hAnsi="Georgia"/>
+          <w:b/>
+          <w:bCs/>
+          <w:color w:val="1C2B29"/>
+          <w:sz w:val="21"/>
+          <w:szCs w:val="21"/>
+        </w:rPr>
         <w:t xml:space="preserve">Log (build A, exit 0): </w:t>
       </w:r>
       <w:r>
@@ -15073,6 +15228,37 @@
           <w:sz w:val="21"/>
           <w:szCs w:val="21"/>
         </w:rPr>
+        <w:t xml:space="preserve">Command: </w:t>
+      </w:r>
+      <w:r>
+        <w:rPr>
+          <w:rFonts w:ascii="Georgia" w:cs="Georgia" w:eastAsia="Georgia" w:hAnsi="Georgia"/>
+          <w:color w:val="222222"/>
+          <w:sz w:val="21"/>
+          <w:szCs w:val="21"/>
+        </w:rPr>
+        <w:t xml:space="preserve">xezim -s top e_cg_pkg_noargs_class.sv; suite form U09-11 in uvm_suite/u09_coverage.sv (./run_suite.sh tests xezim)</w:t>
+      </w:r>
+    </w:p>
+    <w:p>
+      <w:pPr>
+        <w:pStyle w:val="ListParagraph"/>
+        <w:numPr>
+          <w:ilvl w:val="0"/>
+          <w:numId w:val="2"/>
+        </w:numPr>
+        <w:spacing w:after="90" w:line="270"/>
+        <w:jc w:val="both"/>
+      </w:pPr>
+      <w:r>
+        <w:rPr>
+          <w:rFonts w:ascii="Georgia" w:cs="Georgia" w:eastAsia="Georgia" w:hAnsi="Georgia"/>
+          <w:b/>
+          <w:bCs/>
+          <w:color w:val="1C2B29"/>
+          <w:sz w:val="21"/>
+          <w:szCs w:val="21"/>
+        </w:rPr>
         <w:t xml:space="preserve">Log (build A, exit 0): </w:t>
       </w:r>
       <w:r>
@@ -15816,6 +16002,37 @@
           <w:sz w:val="21"/>
           <w:szCs w:val="21"/>
         </w:rPr>
+        <w:t xml:space="preserve">Command: </w:t>
+      </w:r>
+      <w:r>
+        <w:rPr>
+          <w:rFonts w:ascii="Georgia" w:cs="Georgia" w:eastAsia="Georgia" w:hAnsi="Georgia"/>
+          <w:color w:val="222222"/>
+          <w:sz w:val="21"/>
+          <w:szCs w:val="21"/>
+        </w:rPr>
+        <w:t xml:space="preserve">xezim -s top e_cg_type_option_scope.sv</w:t>
+      </w:r>
+    </w:p>
+    <w:p>
+      <w:pPr>
+        <w:pStyle w:val="ListParagraph"/>
+        <w:numPr>
+          <w:ilvl w:val="0"/>
+          <w:numId w:val="2"/>
+        </w:numPr>
+        <w:spacing w:after="90" w:line="270"/>
+        <w:jc w:val="both"/>
+      </w:pPr>
+      <w:r>
+        <w:rPr>
+          <w:rFonts w:ascii="Georgia" w:cs="Georgia" w:eastAsia="Georgia" w:hAnsi="Georgia"/>
+          <w:b/>
+          <w:bCs/>
+          <w:color w:val="1C2B29"/>
+          <w:sz w:val="21"/>
+          <w:szCs w:val="21"/>
+        </w:rPr>
         <w:t xml:space="preserve">Log (build A, exit 1): </w:t>
       </w:r>
       <w:r>
@@ -16059,7 +16276,69 @@
           <w:sz w:val="21"/>
           <w:szCs w:val="21"/>
         </w:rPr>
-        <w:t xml:space="preserve">Simulation error: Undeclared identifier 'a_off' at e_assertoff_in_module.sv:7:25, exit 1.</w:t>
+        <w:t xml:space="preserve">the run aborts at time 0 before any assertion is evaluated.</w:t>
+      </w:r>
+    </w:p>
+    <w:p>
+      <w:pPr>
+        <w:pStyle w:val="ListParagraph"/>
+        <w:numPr>
+          <w:ilvl w:val="0"/>
+          <w:numId w:val="2"/>
+        </w:numPr>
+        <w:spacing w:after="90" w:line="270"/>
+        <w:jc w:val="both"/>
+      </w:pPr>
+      <w:r>
+        <w:rPr>
+          <w:rFonts w:ascii="Georgia" w:cs="Georgia" w:eastAsia="Georgia" w:hAnsi="Georgia"/>
+          <w:b/>
+          <w:bCs/>
+          <w:color w:val="1C2B29"/>
+          <w:sz w:val="21"/>
+          <w:szCs w:val="21"/>
+        </w:rPr>
+        <w:t xml:space="preserve">Command: </w:t>
+      </w:r>
+      <w:r>
+        <w:rPr>
+          <w:rFonts w:ascii="Georgia" w:cs="Georgia" w:eastAsia="Georgia" w:hAnsi="Georgia"/>
+          <w:color w:val="222222"/>
+          <w:sz w:val="21"/>
+          <w:szCs w:val="21"/>
+        </w:rPr>
+        <w:t xml:space="preserve">xezim -s top e_assertoff_in_module.sv</w:t>
+      </w:r>
+    </w:p>
+    <w:p>
+      <w:pPr>
+        <w:pStyle w:val="ListParagraph"/>
+        <w:numPr>
+          <w:ilvl w:val="0"/>
+          <w:numId w:val="2"/>
+        </w:numPr>
+        <w:spacing w:after="90" w:line="270"/>
+        <w:jc w:val="both"/>
+      </w:pPr>
+      <w:r>
+        <w:rPr>
+          <w:rFonts w:ascii="Georgia" w:cs="Georgia" w:eastAsia="Georgia" w:hAnsi="Georgia"/>
+          <w:b/>
+          <w:bCs/>
+          <w:color w:val="1C2B29"/>
+          <w:sz w:val="21"/>
+          <w:szCs w:val="21"/>
+        </w:rPr>
+        <w:t xml:space="preserve">Log (builds A and B, exit 1): </w:t>
+      </w:r>
+      <w:r>
+        <w:rPr>
+          <w:rFonts w:ascii="Georgia" w:cs="Georgia" w:eastAsia="Georgia" w:hAnsi="Georgia"/>
+          <w:color w:val="222222"/>
+          <w:sz w:val="21"/>
+          <w:szCs w:val="21"/>
+        </w:rPr>
+        <w:t xml:space="preserve">Simulation error: Undeclared identifier 'a_off' at e_assertoff_in_module.sv:7:25. Control e_assertoff_in_top.sv (exit 0): RESULT bare_t0: a_on 4 a_off 0 (expect 4 0).</w:t>
       </w:r>
     </w:p>
     <w:p>
@@ -16346,6 +16625,37 @@
           <w:sz w:val="21"/>
           <w:szCs w:val="21"/>
         </w:rPr>
+        <w:t xml:space="preserve">Command: </w:t>
+      </w:r>
+      <w:r>
+        <w:rPr>
+          <w:rFonts w:ascii="Georgia" w:cs="Georgia" w:eastAsia="Georgia" w:hAnsi="Georgia"/>
+          <w:color w:val="222222"/>
+          <w:sz w:val="21"/>
+          <w:szCs w:val="21"/>
+        </w:rPr>
+        <w:t xml:space="preserve">xezim -s top e_struct_dynarray_copy.sv</w:t>
+      </w:r>
+    </w:p>
+    <w:p>
+      <w:pPr>
+        <w:pStyle w:val="ListParagraph"/>
+        <w:numPr>
+          <w:ilvl w:val="0"/>
+          <w:numId w:val="2"/>
+        </w:numPr>
+        <w:spacing w:after="90" w:line="270"/>
+        <w:jc w:val="both"/>
+      </w:pPr>
+      <w:r>
+        <w:rPr>
+          <w:rFonts w:ascii="Georgia" w:cs="Georgia" w:eastAsia="Georgia" w:hAnsi="Georgia"/>
+          <w:b/>
+          <w:bCs/>
+          <w:color w:val="1C2B29"/>
+          <w:sz w:val="21"/>
+          <w:szCs w:val="21"/>
+        </w:rPr>
         <w:t xml:space="preserve">Log (build A, exit 0): </w:t>
       </w:r>
       <w:r>
@@ -16925,6 +17235,37 @@
           <w:sz w:val="21"/>
           <w:szCs w:val="21"/>
         </w:rPr>
+        <w:t xml:space="preserve">Expected: </w:t>
+      </w:r>
+      <w:r>
+        <w:rPr>
+          <w:rFonts w:ascii="Georgia" w:cs="Georgia" w:eastAsia="Georgia" w:hAnsi="Georgia"/>
+          <w:color w:val="222222"/>
+          <w:sz w:val="21"/>
+          <w:szCs w:val="21"/>
+        </w:rPr>
+        <w:t xml:space="preserve">the run completes and writes an FST file, as it does with VCD (--wave) on the same test.</w:t>
+      </w:r>
+    </w:p>
+    <w:p>
+      <w:pPr>
+        <w:pStyle w:val="ListParagraph"/>
+        <w:numPr>
+          <w:ilvl w:val="0"/>
+          <w:numId w:val="2"/>
+        </w:numPr>
+        <w:spacing w:after="90" w:line="270"/>
+        <w:jc w:val="both"/>
+      </w:pPr>
+      <w:r>
+        <w:rPr>
+          <w:rFonts w:ascii="Georgia" w:cs="Georgia" w:eastAsia="Georgia" w:hAnsi="Georgia"/>
+          <w:b/>
+          <w:bCs/>
+          <w:color w:val="1C2B29"/>
+          <w:sz w:val="21"/>
+          <w:szCs w:val="21"/>
+        </w:rPr>
         <w:t xml:space="preserve">Condition: </w:t>
       </w:r>
       <w:r>
@@ -16966,6 +17307,37 @@
           <w:szCs w:val="21"/>
         </w:rPr>
         <w:t xml:space="preserve">thread 'xezim-fst' panicked at .../fst-writer-0.3.1/src/buffer.rs:117:17: Failed to parse four state value: 00000000000000000000000011101110 for signal of size 1, exit 134.</w:t>
+      </w:r>
+    </w:p>
+    <w:p>
+      <w:pPr>
+        <w:pStyle w:val="ListParagraph"/>
+        <w:numPr>
+          <w:ilvl w:val="0"/>
+          <w:numId w:val="2"/>
+        </w:numPr>
+        <w:spacing w:after="90" w:line="270"/>
+        <w:jc w:val="both"/>
+      </w:pPr>
+      <w:r>
+        <w:rPr>
+          <w:rFonts w:ascii="Georgia" w:cs="Georgia" w:eastAsia="Georgia" w:hAnsi="Georgia"/>
+          <w:b/>
+          <w:bCs/>
+          <w:color w:val="1C2B29"/>
+          <w:sz w:val="21"/>
+          <w:szCs w:val="21"/>
+        </w:rPr>
+        <w:t xml:space="preserve">Reproducer: </w:t>
+      </w:r>
+      <w:r>
+        <w:rPr>
+          <w:rFonts w:ascii="Georgia" w:cs="Georgia" w:eastAsia="Georgia" w:hAnsi="Georgia"/>
+          <w:color w:val="222222"/>
+          <w:sz w:val="21"/>
+          <w:szCs w:val="21"/>
+        </w:rPr>
+        <w:t xml:space="preserve">the full PCIe environment (dv/sim, test pcie_link_up_test, seed 1). Not reduced to a minimal case.</w:t>
       </w:r>
     </w:p>
     <w:p>
@@ -17261,7 +17633,7 @@
           <w:sz w:val="21"/>
           <w:szCs w:val="21"/>
         </w:rPr>
-        <w:t xml:space="preserve">cases/c_protect.sv. Log (build B): before envelope / after envelope, exit 0. Log: xissues_recheck/c_protect.xezim_head.log.</w:t>
+        <w:t xml:space="preserve">cases/c_protect.sv. Command: xezim c_protect.sv. Log (build B): before envelope / after envelope, exit 0. Log: xissues_recheck/c_protect.xezim_head.log.</w:t>
       </w:r>
     </w:p>
     <w:p>
@@ -17424,6 +17796,37 @@
           <w:sz w:val="21"/>
           <w:szCs w:val="21"/>
         </w:rPr>
+        <w:t xml:space="preserve">Expected: </w:t>
+      </w:r>
+      <w:r>
+        <w:rPr>
+          <w:rFonts w:ascii="Georgia" w:cs="Georgia" w:eastAsia="Georgia" w:hAnsi="Georgia"/>
+          <w:color w:val="222222"/>
+          <w:sz w:val="21"/>
+          <w:szCs w:val="21"/>
+        </w:rPr>
+        <w:t xml:space="preserve">.name() returns the name of the value in its own enum type: UVM_WARNING (IEEE 1800-2017 6.19.5.6).</w:t>
+      </w:r>
+    </w:p>
+    <w:p>
+      <w:pPr>
+        <w:pStyle w:val="ListParagraph"/>
+        <w:numPr>
+          <w:ilvl w:val="0"/>
+          <w:numId w:val="2"/>
+        </w:numPr>
+        <w:spacing w:after="90" w:line="270"/>
+        <w:jc w:val="both"/>
+      </w:pPr>
+      <w:r>
+        <w:rPr>
+          <w:rFonts w:ascii="Georgia" w:cs="Georgia" w:eastAsia="Georgia" w:hAnsi="Georgia"/>
+          <w:b/>
+          <w:bCs/>
+          <w:color w:val="1C2B29"/>
+          <w:sz w:val="21"/>
+          <w:szCs w:val="21"/>
+        </w:rPr>
         <w:t xml:space="preserve">Observed: </w:t>
       </w:r>
       <w:r>
@@ -17464,7 +17867,7 @@
           <w:sz w:val="21"/>
           <w:szCs w:val="21"/>
         </w:rPr>
-        <w:t xml:space="preserve">cases2/e_enum_name.sv. Log: RESULT get_severity().name()=UVM_PHASE_DORMANT  local var .name()=UVM_WARNING  value=1 (expect UVM_WARNING UVM_WARNING 1)</w:t>
+        <w:t xml:space="preserve">cases2/e_enum_name.sv. Command: xezim -uvm -s top --max-time 1ms e_enum_name.sv. Log (exit 0): RESULT get_severity().name()=UVM_PHASE_DORMANT  local var .name()=UVM_WARNING  value=1 (expect UVM_WARNING UVM_WARNING 1)</w:t>
       </w:r>
     </w:p>
     <w:p>
@@ -17667,7 +18070,87 @@
           <w:sz w:val="21"/>
           <w:szCs w:val="21"/>
         </w:rPr>
-        <w:t xml:space="preserve">per-run JSON files are written. dv/sim/cov_merge.py merges functional coverage across runs as a project-side workaround.</w:t>
+        <w:t xml:space="preserve"/>
+      </w:r>
+    </w:p>
+    <w:p>
+      <w:pPr>
+        <w:pStyle w:val="ListParagraph"/>
+        <w:numPr>
+          <w:ilvl w:val="0"/>
+          <w:numId w:val="2"/>
+        </w:numPr>
+        <w:spacing w:after="90" w:line="270"/>
+        <w:jc w:val="both"/>
+      </w:pPr>
+      <w:r>
+        <w:rPr>
+          <w:rFonts w:ascii="Georgia" w:cs="Georgia" w:eastAsia="Georgia" w:hAnsi="Georgia"/>
+          <w:color w:val="222222"/>
+          <w:sz w:val="21"/>
+          <w:szCs w:val="21"/>
+        </w:rPr>
+        <w:t xml:space="preserve">    Reproducer cases2/e_cov_system_functions.sv, command xezim -s top e_cov_system_functions.sv.</w:t>
+      </w:r>
+    </w:p>
+    <w:p>
+      <w:pPr>
+        <w:pStyle w:val="ListParagraph"/>
+        <w:numPr>
+          <w:ilvl w:val="0"/>
+          <w:numId w:val="2"/>
+        </w:numPr>
+        <w:spacing w:after="90" w:line="270"/>
+        <w:jc w:val="both"/>
+      </w:pPr>
+      <w:r>
+        <w:rPr>
+          <w:rFonts w:ascii="Georgia" w:cs="Georgia" w:eastAsia="Georgia" w:hAnsi="Georgia"/>
+          <w:color w:val="222222"/>
+          <w:sz w:val="21"/>
+          <w:szCs w:val="21"/>
+        </w:rPr>
+        <w:t xml:space="preserve">    Log (builds A and B, exit 0): Warning: unknown system task '$coverage_merge' ignored (first use at e_cov_system_functions.sv:6:25) / RESULT $coverage_merge returned 0 / RESULT $coverage_save returned 0.</w:t>
+      </w:r>
+    </w:p>
+    <w:p>
+      <w:pPr>
+        <w:pStyle w:val="ListParagraph"/>
+        <w:numPr>
+          <w:ilvl w:val="0"/>
+          <w:numId w:val="2"/>
+        </w:numPr>
+        <w:spacing w:after="90" w:line="270"/>
+        <w:jc w:val="both"/>
+      </w:pPr>
+      <w:r>
+        <w:rPr>
+          <w:rFonts w:ascii="Georgia" w:cs="Georgia" w:eastAsia="Georgia" w:hAnsi="Georgia"/>
+          <w:color w:val="222222"/>
+          <w:sz w:val="21"/>
+          <w:szCs w:val="21"/>
+        </w:rPr>
+        <w:t xml:space="preserve">    Per-run JSON files are written. dv/sim/cov_merge.py merges functional coverage across runs as a project-side workaround.</w:t>
+      </w:r>
+    </w:p>
+    <w:p>
+      <w:pPr>
+        <w:pStyle w:val="ListParagraph"/>
+        <w:numPr>
+          <w:ilvl w:val="0"/>
+          <w:numId w:val="2"/>
+        </w:numPr>
+        <w:spacing w:after="90" w:line="270"/>
+        <w:jc w:val="both"/>
+      </w:pPr>
+      <w:r>
+        <w:rPr>
+          <w:rFonts w:ascii="Georgia" w:cs="Georgia" w:eastAsia="Georgia" w:hAnsi="Georgia"/>
+          <w:color w:val="222222"/>
+          <w:sz w:val="21"/>
+          <w:szCs w:val="21"/>
+        </w:rPr>
+        <w:t xml:space="preserve">    Condition, expression and FSM coverage were not tested beyond this documentation statement.</w:t>
       </w:r>
     </w:p>
     <w:p>
@@ -17840,6 +18323,68 @@
           <w:szCs w:val="21"/>
         </w:rPr>
         <w:t xml:space="preserve">uvm_hdl_force("top.d.r[3:0]", 0) returns 0 and prints [DPI] error: uvm_hdl_force("top.d.r[3:0]"): forcing part of a signal is not supported; nothing was forced (U12-12). Whole-signal force, release and deposit work (U12-06 to U12-10).</w:t>
+      </w:r>
+    </w:p>
+    <w:p>
+      <w:pPr>
+        <w:pStyle w:val="ListParagraph"/>
+        <w:numPr>
+          <w:ilvl w:val="0"/>
+          <w:numId w:val="2"/>
+        </w:numPr>
+        <w:spacing w:after="90" w:line="270"/>
+        <w:jc w:val="both"/>
+      </w:pPr>
+      <w:r>
+        <w:rPr>
+          <w:rFonts w:ascii="Georgia" w:cs="Georgia" w:eastAsia="Georgia" w:hAnsi="Georgia"/>
+          <w:b/>
+          <w:bCs/>
+          <w:color w:val="1C2B29"/>
+          <w:sz w:val="21"/>
+          <w:szCs w:val="21"/>
+        </w:rPr>
+        <w:t xml:space="preserve">Reproducer: </w:t>
+      </w:r>
+      <w:r>
+        <w:rPr>
+          <w:rFonts w:ascii="Georgia" w:cs="Georgia" w:eastAsia="Georgia" w:hAnsi="Georgia"/>
+          <w:color w:val="222222"/>
+          <w:sz w:val="21"/>
+          <w:szCs w:val="21"/>
+        </w:rPr>
+        <w:t xml:space="preserve">check U12-12 in uvm_suite/u12_hdl.sv. Command: XEZIM_UVM_DIR=~/uvm XEZIM_UVM_VERSION=1.2 xezim -uvm -s top --max-time 10ms u12_hdl.sv +UVM_TESTNAME=u12_test. Log: uvm_suite/results/&lt;build&gt;/u12_test.log (exit 0), line CHECK U12-12 PASS documented limitation: partial force returns 0.</w:t>
+      </w:r>
+    </w:p>
+    <w:p>
+      <w:pPr>
+        <w:pStyle w:val="ListParagraph"/>
+        <w:numPr>
+          <w:ilvl w:val="0"/>
+          <w:numId w:val="2"/>
+        </w:numPr>
+        <w:spacing w:after="90" w:line="270"/>
+        <w:jc w:val="both"/>
+      </w:pPr>
+      <w:r>
+        <w:rPr>
+          <w:rFonts w:ascii="Georgia" w:cs="Georgia" w:eastAsia="Georgia" w:hAnsi="Georgia"/>
+          <w:b/>
+          <w:bCs/>
+          <w:color w:val="1C2B29"/>
+          <w:sz w:val="21"/>
+          <w:szCs w:val="21"/>
+        </w:rPr>
+        <w:t xml:space="preserve">PCIe impact: </w:t>
+      </w:r>
+      <w:r>
+        <w:rPr>
+          <w:rFonts w:ascii="Georgia" w:cs="Georgia" w:eastAsia="Georgia" w:hAnsi="Georgia"/>
+          <w:color w:val="222222"/>
+          <w:sz w:val="21"/>
+          <w:szCs w:val="21"/>
+        </w:rPr>
+        <w:t xml:space="preserve">fault injection on a field of a wider register (for example one bit of an LTSSM state vector) cannot be forced from the testbench; the whole signal must be forced.</w:t>
       </w:r>
     </w:p>
     <w:p>
@@ -21689,6 +22234,21 @@
           <w:szCs w:val="26"/>
         </w:rPr>
         <w:t xml:space="preserve">PCIe project impact</w:t>
+      </w:r>
+    </w:p>
+    <w:p>
+      <w:pPr>
+        <w:spacing w:after="140" w:line="276"/>
+        <w:jc w:val="both"/>
+      </w:pPr>
+      <w:r>
+        <w:rPr>
+          <w:rFonts w:ascii="Georgia" w:cs="Georgia" w:eastAsia="Georgia" w:hAnsi="Georgia"/>
+          <w:color w:val="222222"/>
+          <w:sz w:val="21"/>
+          <w:szCs w:val="21"/>
+        </w:rPr>
+        <w:t xml:space="preserve">Applicability to PCIe Gen5 and Gen7. All limitations in this report concern SystemVerilog language semantics, the UVM library, coverage, assertions or tool infrastructure. None depends on the PCIe generation, link speed or encoding. They apply equally to a Gen5 or a Gen7 UVM environment that uses the affected construct. Only the Gen7 project in this repository was exercised; no Gen5 environment and no commercial PCIe VIP was run, so generation-specific effects (for example of FLIT-mode data structures) are Unverified.</w:t>
       </w:r>
     </w:p>
     <w:tbl>

</xml_diff>